<commit_message>
docs: update CLAUDE.md and regenerate spec for Phase 7 (QA test suite)
Spec updates for JFDOCS-7: documents Docs module test coverage (54 tests),
corrects stale isPublic description, adds Docs Search / Sidebar Navigation /
Permission Enforcement subsections, removes 'DocSpace visibility toggle' from
planned features (now implemented), and extends the project roles matrix with
delete-pages and toggle-visibility rows.

Co-Authored-By: Claude Sonnet 4.6 <noreply@anthropic.com>
</commit_message>
<xml_diff>
--- a/.context-docs/JedForge-FunctionalSpec-v2.0.docx
+++ b/.context-docs/JedForge-FunctionalSpec-v2.0.docx
@@ -532,6 +532,44 @@
           <w:szCs w:val="20"/>
         </w:rPr>
         <w:t xml:space="preserve">Docs module fully documented (DocSpace, sections, pages, file uploads, version history, cross-links)</w:t>
+      </w:r>
+    </w:p>
+    <w:p>
+      <w:pPr>
+        <w:pStyle w:val="ListParagraph"/>
+        <w:numPr>
+          <w:ilvl w:val="0"/>
+          <w:numId w:val="2"/>
+        </w:numPr>
+        <w:spacing w:after="20" w:before="20"/>
+        <w:ind w:left="360" w:hanging="360"/>
+      </w:pPr>
+      <w:r>
+        <w:rPr>
+          <w:rFonts w:ascii="Arial" w:cs="Arial" w:eastAsia="Arial" w:hAnsi="Arial"/>
+          <w:sz w:val="20"/>
+          <w:szCs w:val="20"/>
+        </w:rPr>
+        <w:t xml:space="preserve">Docs module Phase 7 QA — 54 Vitest tests added (src/__tests__/docs.test.ts); resolveDocCtx, all route handlers, permission matrix, revision side-effect, search snippet logic</w:t>
+      </w:r>
+    </w:p>
+    <w:p>
+      <w:pPr>
+        <w:pStyle w:val="ListParagraph"/>
+        <w:numPr>
+          <w:ilvl w:val="0"/>
+          <w:numId w:val="2"/>
+        </w:numPr>
+        <w:spacing w:after="20" w:before="20"/>
+        <w:ind w:left="360" w:hanging="360"/>
+      </w:pPr>
+      <w:r>
+        <w:rPr>
+          <w:rFonts w:ascii="Arial" w:cs="Arial" w:eastAsia="Arial" w:hAnsi="Arial"/>
+          <w:sz w:val="20"/>
+          <w:szCs w:val="20"/>
+        </w:rPr>
+        <w:t xml:space="preserve">Docs module search, public docspace visibility, sidebar navigation, and permission enforcement documented (Phases 5–6)</w:t>
       </w:r>
     </w:p>
     <w:p>
@@ -3305,7 +3343,45 @@
           <w:sz w:val="20"/>
           <w:szCs w:val="20"/>
         </w:rPr>
-        <w:t xml:space="preserve">isPublic field reserved for a future Phase 5 visibility toggle (all authenticated users can read). Do not repurpose.</w:t>
+        <w:t xml:space="preserve">isPublic controls public visibility. PROJECT_LEAD can toggle via PATCH /api/docs/[projectKey] with { isPublic: boolean }.</w:t>
+      </w:r>
+    </w:p>
+    <w:p>
+      <w:pPr>
+        <w:pStyle w:val="ListParagraph"/>
+        <w:numPr>
+          <w:ilvl w:val="0"/>
+          <w:numId w:val="2"/>
+        </w:numPr>
+        <w:spacing w:after="20" w:before="20"/>
+        <w:ind w:left="360" w:hanging="360"/>
+      </w:pPr>
+      <w:r>
+        <w:rPr>
+          <w:rFonts w:ascii="Arial" w:cs="Arial" w:eastAsia="Arial" w:hAnsi="Arial"/>
+          <w:sz w:val="20"/>
+          <w:szCs w:val="20"/>
+        </w:rPr>
+        <w:t xml:space="preserve">When isPublic is true, any authenticated JedForge user can read all pages in the docspace, even without a ProjectMember row. Write operations (create, edit, delete) still require an active project membership.</w:t>
+      </w:r>
+    </w:p>
+    <w:p>
+      <w:pPr>
+        <w:pStyle w:val="ListParagraph"/>
+        <w:numPr>
+          <w:ilvl w:val="0"/>
+          <w:numId w:val="2"/>
+        </w:numPr>
+        <w:spacing w:after="20" w:before="20"/>
+        <w:ind w:left="360" w:hanging="360"/>
+      </w:pPr>
+      <w:r>
+        <w:rPr>
+          <w:rFonts w:ascii="Arial" w:cs="Arial" w:eastAsia="Arial" w:hAnsi="Arial"/>
+          <w:sz w:val="20"/>
+          <w:szCs w:val="20"/>
+        </w:rPr>
+        <w:t xml:space="preserve">resolveDocCtx (src/app/api/docs/_helpers.ts) handles all access resolution: it upserts the docspace for members, returns role=null for public non-members, and returns null (deny) for non-members on private docspaces.</w:t>
       </w:r>
     </w:p>
     <w:p>
@@ -3771,6 +3847,378 @@
           <w:szCs w:val="20"/>
         </w:rPr>
         <w:t xml:space="preserve">Manage links via linkDocPage / unlinkDocPage in actions.ts; read linked issues via GET /api/docs/[projectKey]/pages/[pageId]/links.</w:t>
+      </w:r>
+    </w:p>
+    <w:p>
+      <w:pPr>
+        <w:pStyle w:val="Heading3"/>
+        <w:spacing w:after="60" w:before="160"/>
+        <w:outlineLvl w:val="2"/>
+      </w:pPr>
+      <w:r>
+        <w:rPr>
+          <w:rFonts w:ascii="Arial" w:cs="Arial" w:eastAsia="Arial" w:hAnsi="Arial"/>
+          <w:b/>
+          <w:bCs/>
+          <w:sz w:val="22"/>
+          <w:szCs w:val="22"/>
+        </w:rPr>
+        <w:t xml:space="preserve">Docs Search</w:t>
+      </w:r>
+    </w:p>
+    <w:p>
+      <w:pPr>
+        <w:pStyle w:val="ListParagraph"/>
+        <w:numPr>
+          <w:ilvl w:val="0"/>
+          <w:numId w:val="2"/>
+        </w:numPr>
+        <w:spacing w:after="20" w:before="20"/>
+        <w:ind w:left="360" w:hanging="360"/>
+      </w:pPr>
+      <w:r>
+        <w:rPr>
+          <w:rFonts w:ascii="Arial" w:cs="Arial" w:eastAsia="Arial" w:hAnsi="Arial"/>
+          <w:sz w:val="20"/>
+          <w:szCs w:val="20"/>
+        </w:rPr>
+        <w:t xml:space="preserve">GET /api/docs/[projectKey]/search?q=&lt;query&gt; — case-insensitive substring search across page titles and NATIVE page content.</w:t>
+      </w:r>
+    </w:p>
+    <w:p>
+      <w:pPr>
+        <w:pStyle w:val="ListParagraph"/>
+        <w:numPr>
+          <w:ilvl w:val="0"/>
+          <w:numId w:val="2"/>
+        </w:numPr>
+        <w:spacing w:after="20" w:before="20"/>
+        <w:ind w:left="360" w:hanging="360"/>
+      </w:pPr>
+      <w:r>
+        <w:rPr>
+          <w:rFonts w:ascii="Arial" w:cs="Arial" w:eastAsia="Arial" w:hAnsi="Arial"/>
+          <w:sz w:val="20"/>
+          <w:szCs w:val="20"/>
+        </w:rPr>
+        <w:t xml:space="preserve">Returns up to 20 results ordered by updatedAt desc, each with: id, title, type, sectionId, sectionTitle, snippet, updatedAt.</w:t>
+      </w:r>
+    </w:p>
+    <w:p>
+      <w:pPr>
+        <w:pStyle w:val="ListParagraph"/>
+        <w:numPr>
+          <w:ilvl w:val="0"/>
+          <w:numId w:val="2"/>
+        </w:numPr>
+        <w:spacing w:after="20" w:before="20"/>
+        <w:ind w:left="360" w:hanging="360"/>
+      </w:pPr>
+      <w:r>
+        <w:rPr>
+          <w:rFonts w:ascii="Arial" w:cs="Arial" w:eastAsia="Arial" w:hAnsi="Arial"/>
+          <w:sz w:val="20"/>
+          <w:szCs w:val="20"/>
+        </w:rPr>
+        <w:t xml:space="preserve">snippet is a plain-text excerpt (HTML tags stripped) around the matching term for NATIVE pages; null for DOCUMENT pages.</w:t>
+      </w:r>
+    </w:p>
+    <w:p>
+      <w:pPr>
+        <w:pStyle w:val="ListParagraph"/>
+        <w:numPr>
+          <w:ilvl w:val="0"/>
+          <w:numId w:val="2"/>
+        </w:numPr>
+        <w:spacing w:after="20" w:before="20"/>
+        <w:ind w:left="360" w:hanging="360"/>
+      </w:pPr>
+      <w:r>
+        <w:rPr>
+          <w:rFonts w:ascii="Arial" w:cs="Arial" w:eastAsia="Arial" w:hAnsi="Arial"/>
+          <w:sz w:val="20"/>
+          <w:szCs w:val="20"/>
+        </w:rPr>
+        <w:t xml:space="preserve">Accessible to any user with read access to the docspace (project members and public non-members).</w:t>
+      </w:r>
+    </w:p>
+    <w:p>
+      <w:pPr>
+        <w:pStyle w:val="Heading3"/>
+        <w:spacing w:after="60" w:before="160"/>
+        <w:outlineLvl w:val="2"/>
+      </w:pPr>
+      <w:r>
+        <w:rPr>
+          <w:rFonts w:ascii="Arial" w:cs="Arial" w:eastAsia="Arial" w:hAnsi="Arial"/>
+          <w:b/>
+          <w:bCs/>
+          <w:sz w:val="22"/>
+          <w:szCs w:val="22"/>
+        </w:rPr>
+        <w:t xml:space="preserve">Sidebar Navigation</w:t>
+      </w:r>
+    </w:p>
+    <w:p>
+      <w:pPr>
+        <w:pStyle w:val="ListParagraph"/>
+        <w:numPr>
+          <w:ilvl w:val="0"/>
+          <w:numId w:val="2"/>
+        </w:numPr>
+        <w:spacing w:after="20" w:before="20"/>
+        <w:ind w:left="360" w:hanging="360"/>
+      </w:pPr>
+      <w:r>
+        <w:rPr>
+          <w:rFonts w:ascii="Arial" w:cs="Arial" w:eastAsia="Arial" w:hAnsi="Arial"/>
+          <w:sz w:val="20"/>
+          <w:szCs w:val="20"/>
+        </w:rPr>
+        <w:t xml:space="preserve">The project docs layout (src/app/(dashboard)/projects/[projectKey]/docs/layout.tsx) renders a persistent left sidebar.</w:t>
+      </w:r>
+    </w:p>
+    <w:p>
+      <w:pPr>
+        <w:pStyle w:val="ListParagraph"/>
+        <w:numPr>
+          <w:ilvl w:val="0"/>
+          <w:numId w:val="2"/>
+        </w:numPr>
+        <w:spacing w:after="20" w:before="20"/>
+        <w:ind w:left="360" w:hanging="360"/>
+      </w:pPr>
+      <w:r>
+        <w:rPr>
+          <w:rFonts w:ascii="Arial" w:cs="Arial" w:eastAsia="Arial" w:hAnsi="Arial"/>
+          <w:sz w:val="20"/>
+          <w:szCs w:val="20"/>
+        </w:rPr>
+        <w:t xml:space="preserve">The sidebar lists all sections with their child pages, plus any top-level pages (sectionId: null).</w:t>
+      </w:r>
+    </w:p>
+    <w:p>
+      <w:pPr>
+        <w:pStyle w:val="ListParagraph"/>
+        <w:numPr>
+          <w:ilvl w:val="0"/>
+          <w:numId w:val="2"/>
+        </w:numPr>
+        <w:spacing w:after="20" w:before="20"/>
+        <w:ind w:left="360" w:hanging="360"/>
+      </w:pPr>
+      <w:r>
+        <w:rPr>
+          <w:rFonts w:ascii="Arial" w:cs="Arial" w:eastAsia="Arial" w:hAnsi="Arial"/>
+          <w:sz w:val="20"/>
+          <w:szCs w:val="20"/>
+        </w:rPr>
+        <w:t xml:space="preserve">DocSpace data is fetched server-side in the layout, which also upserts the DocSpace if it does not yet exist.</w:t>
+      </w:r>
+    </w:p>
+    <w:p>
+      <w:pPr>
+        <w:pStyle w:val="ListParagraph"/>
+        <w:numPr>
+          <w:ilvl w:val="0"/>
+          <w:numId w:val="2"/>
+        </w:numPr>
+        <w:spacing w:after="20" w:before="20"/>
+        <w:ind w:left="360" w:hanging="360"/>
+      </w:pPr>
+      <w:r>
+        <w:rPr>
+          <w:rFonts w:ascii="Arial" w:cs="Arial" w:eastAsia="Arial" w:hAnsi="Arial"/>
+          <w:sz w:val="20"/>
+          <w:szCs w:val="20"/>
+        </w:rPr>
+        <w:t xml:space="preserve">Active page is highlighted; navigating to a page does not trigger a full-page reload.</w:t>
+      </w:r>
+    </w:p>
+    <w:p>
+      <w:pPr>
+        <w:pStyle w:val="Heading3"/>
+        <w:spacing w:after="60" w:before="160"/>
+        <w:outlineLvl w:val="2"/>
+      </w:pPr>
+      <w:r>
+        <w:rPr>
+          <w:rFonts w:ascii="Arial" w:cs="Arial" w:eastAsia="Arial" w:hAnsi="Arial"/>
+          <w:b/>
+          <w:bCs/>
+          <w:sz w:val="22"/>
+          <w:szCs w:val="22"/>
+        </w:rPr>
+        <w:t xml:space="preserve">Docs Permission Enforcement</w:t>
+      </w:r>
+    </w:p>
+    <w:p>
+      <w:pPr>
+        <w:pStyle w:val="ListParagraph"/>
+        <w:numPr>
+          <w:ilvl w:val="0"/>
+          <w:numId w:val="2"/>
+        </w:numPr>
+        <w:spacing w:after="20" w:before="20"/>
+        <w:ind w:left="360" w:hanging="360"/>
+      </w:pPr>
+      <w:r>
+        <w:rPr>
+          <w:rFonts w:ascii="Arial" w:cs="Arial" w:eastAsia="Arial" w:hAnsi="Arial"/>
+          <w:sz w:val="20"/>
+          <w:szCs w:val="20"/>
+        </w:rPr>
+        <w:t xml:space="preserve">Read (GET any docs route): any project member, or any authenticated user on a public docspace (role=null).</w:t>
+      </w:r>
+    </w:p>
+    <w:p>
+      <w:pPr>
+        <w:pStyle w:val="ListParagraph"/>
+        <w:numPr>
+          <w:ilvl w:val="0"/>
+          <w:numId w:val="2"/>
+        </w:numPr>
+        <w:spacing w:after="20" w:before="20"/>
+        <w:ind w:left="360" w:hanging="360"/>
+      </w:pPr>
+      <w:r>
+        <w:rPr>
+          <w:rFonts w:ascii="Arial" w:cs="Arial" w:eastAsia="Arial" w:hAnsi="Arial"/>
+          <w:sz w:val="20"/>
+          <w:szCs w:val="20"/>
+        </w:rPr>
+        <w:t xml:space="preserve">Create pages and sections, file upload: TEAM_MEMBER or PROJECT_LEAD (canEditIssues).</w:t>
+      </w:r>
+    </w:p>
+    <w:p>
+      <w:pPr>
+        <w:pStyle w:val="ListParagraph"/>
+        <w:numPr>
+          <w:ilvl w:val="0"/>
+          <w:numId w:val="2"/>
+        </w:numPr>
+        <w:spacing w:after="20" w:before="20"/>
+        <w:ind w:left="360" w:hanging="360"/>
+      </w:pPr>
+      <w:r>
+        <w:rPr>
+          <w:rFonts w:ascii="Arial" w:cs="Arial" w:eastAsia="Arial" w:hAnsi="Arial"/>
+          <w:sz w:val="20"/>
+          <w:szCs w:val="20"/>
+        </w:rPr>
+        <w:t xml:space="preserve">Edit pages and sections (PATCH): TEAM_MEMBER or PROJECT_LEAD (canEditIssues).</w:t>
+      </w:r>
+    </w:p>
+    <w:p>
+      <w:pPr>
+        <w:pStyle w:val="ListParagraph"/>
+        <w:numPr>
+          <w:ilvl w:val="0"/>
+          <w:numId w:val="2"/>
+        </w:numPr>
+        <w:spacing w:after="20" w:before="20"/>
+        <w:ind w:left="360" w:hanging="360"/>
+      </w:pPr>
+      <w:r>
+        <w:rPr>
+          <w:rFonts w:ascii="Arial" w:cs="Arial" w:eastAsia="Arial" w:hAnsi="Arial"/>
+          <w:sz w:val="20"/>
+          <w:szCs w:val="20"/>
+        </w:rPr>
+        <w:t xml:space="preserve">Delete pages and sections (DELETE): PROJECT_LEAD only (canManageProject).</w:t>
+      </w:r>
+    </w:p>
+    <w:p>
+      <w:pPr>
+        <w:pStyle w:val="ListParagraph"/>
+        <w:numPr>
+          <w:ilvl w:val="0"/>
+          <w:numId w:val="2"/>
+        </w:numPr>
+        <w:spacing w:after="20" w:before="20"/>
+        <w:ind w:left="360" w:hanging="360"/>
+      </w:pPr>
+      <w:r>
+        <w:rPr>
+          <w:rFonts w:ascii="Arial" w:cs="Arial" w:eastAsia="Arial" w:hAnsi="Arial"/>
+          <w:sz w:val="20"/>
+          <w:szCs w:val="20"/>
+        </w:rPr>
+        <w:t xml:space="preserve">Toggle docspace visibility (PATCH /api/docs/[projectKey]): PROJECT_LEAD only — checked inline, not via resolveDocCtx.</w:t>
+      </w:r>
+    </w:p>
+    <w:p>
+      <w:pPr>
+        <w:pStyle w:val="Heading3"/>
+        <w:spacing w:after="60" w:before="160"/>
+        <w:outlineLvl w:val="2"/>
+      </w:pPr>
+      <w:r>
+        <w:rPr>
+          <w:rFonts w:ascii="Arial" w:cs="Arial" w:eastAsia="Arial" w:hAnsi="Arial"/>
+          <w:b/>
+          <w:bCs/>
+          <w:sz w:val="22"/>
+          <w:szCs w:val="22"/>
+        </w:rPr>
+        <w:t xml:space="preserve">Docs Module Test Coverage</w:t>
+      </w:r>
+    </w:p>
+    <w:p>
+      <w:pPr>
+        <w:pStyle w:val="ListParagraph"/>
+        <w:numPr>
+          <w:ilvl w:val="0"/>
+          <w:numId w:val="2"/>
+        </w:numPr>
+        <w:spacing w:after="20" w:before="20"/>
+        <w:ind w:left="360" w:hanging="360"/>
+      </w:pPr>
+      <w:r>
+        <w:rPr>
+          <w:rFonts w:ascii="Arial" w:cs="Arial" w:eastAsia="Arial" w:hAnsi="Arial"/>
+          <w:sz w:val="20"/>
+          <w:szCs w:val="20"/>
+        </w:rPr>
+        <w:t xml:space="preserve">src/__tests__/docs.test.ts — 54 Vitest unit tests (Phase 7 / JFDOCS-7).</w:t>
+      </w:r>
+    </w:p>
+    <w:p>
+      <w:pPr>
+        <w:pStyle w:val="ListParagraph"/>
+        <w:numPr>
+          <w:ilvl w:val="0"/>
+          <w:numId w:val="2"/>
+        </w:numPr>
+        <w:spacing w:after="20" w:before="20"/>
+        <w:ind w:left="360" w:hanging="360"/>
+      </w:pPr>
+      <w:r>
+        <w:rPr>
+          <w:rFonts w:ascii="Arial" w:cs="Arial" w:eastAsia="Arial" w:hAnsi="Arial"/>
+          <w:sz w:val="20"/>
+          <w:szCs w:val="20"/>
+        </w:rPr>
+        <w:t xml:space="preserve">Coverage: resolveDocCtx (5 cases), docspace GET/PATCH, pages GET/POST/PATCH/DELETE, sections GET/POST/PATCH/DELETE, search including HTML stripping, revisions GET.</w:t>
+      </w:r>
+    </w:p>
+    <w:p>
+      <w:pPr>
+        <w:pStyle w:val="ListParagraph"/>
+        <w:numPr>
+          <w:ilvl w:val="0"/>
+          <w:numId w:val="2"/>
+        </w:numPr>
+        <w:spacing w:after="20" w:before="20"/>
+        <w:ind w:left="360" w:hanging="360"/>
+      </w:pPr>
+      <w:r>
+        <w:rPr>
+          <w:rFonts w:ascii="Arial" w:cs="Arial" w:eastAsia="Arial" w:hAnsi="Arial"/>
+          <w:sz w:val="20"/>
+          <w:szCs w:val="20"/>
+        </w:rPr>
+        <w:t xml:space="preserve">Permission matrix verified for every write endpoint across PROJECT_LEAD, TEAM_MEMBER, VIEWER, and public non-member (role=null).</w:t>
       </w:r>
     </w:p>
     <w:p>
@@ -10016,7 +10464,7 @@
                 <w:sz w:val="18"/>
                 <w:szCs w:val="18"/>
               </w:rPr>
-              <w:t xml:space="preserve">Create / edit doc pages</w:t>
+              <w:t xml:space="preserve">Create / edit doc pages and sections</w:t>
             </w:r>
           </w:p>
         </w:tc>
@@ -10067,6 +10515,210 @@
                 <w:szCs w:val="18"/>
               </w:rPr>
               <w:t xml:space="preserve">Yes</w:t>
+            </w:r>
+          </w:p>
+        </w:tc>
+        <w:tc>
+          <w:tcPr>
+            <w:tcW w:type="dxa" w:w="1685"/>
+            <w:tcBorders>
+              <w:top w:val="single" w:color="BFBFBF" w:sz="4"/>
+              <w:left w:val="single" w:color="BFBFBF" w:sz="4"/>
+              <w:bottom w:val="single" w:color="BFBFBF" w:sz="4"/>
+              <w:right w:val="single" w:color="BFBFBF" w:sz="4"/>
+            </w:tcBorders>
+            <w:shd w:fill="FFFFFF" w:color="FFFFFF" w:val="clear"/>
+          </w:tcPr>
+          <w:p>
+            <w:pPr>
+              <w:spacing w:after="40" w:before="40"/>
+            </w:pPr>
+            <w:r>
+              <w:rPr>
+                <w:rFonts w:ascii="Arial" w:cs="Arial" w:eastAsia="Arial" w:hAnsi="Arial"/>
+                <w:sz w:val="18"/>
+                <w:szCs w:val="18"/>
+              </w:rPr>
+              <w:t xml:space="preserve">Yes</w:t>
+            </w:r>
+          </w:p>
+        </w:tc>
+      </w:tr>
+      <w:tr>
+        <w:tc>
+          <w:tcPr>
+            <w:tcW w:type="dxa" w:w="4306"/>
+            <w:tcBorders>
+              <w:top w:val="single" w:color="BFBFBF" w:sz="4"/>
+              <w:left w:val="single" w:color="BFBFBF" w:sz="4"/>
+              <w:bottom w:val="single" w:color="BFBFBF" w:sz="4"/>
+              <w:right w:val="single" w:color="BFBFBF" w:sz="4"/>
+            </w:tcBorders>
+            <w:shd w:fill="F2F2F2" w:color="F2F2F2" w:val="clear"/>
+          </w:tcPr>
+          <w:p>
+            <w:pPr>
+              <w:spacing w:after="40" w:before="40"/>
+            </w:pPr>
+            <w:r>
+              <w:rPr>
+                <w:rFonts w:ascii="Arial" w:cs="Arial" w:eastAsia="Arial" w:hAnsi="Arial"/>
+                <w:sz w:val="18"/>
+                <w:szCs w:val="18"/>
+              </w:rPr>
+              <w:t xml:space="preserve">Delete doc pages and sections</w:t>
+            </w:r>
+          </w:p>
+        </w:tc>
+        <w:tc>
+          <w:tcPr>
+            <w:tcW w:type="dxa" w:w="1685"/>
+            <w:tcBorders>
+              <w:top w:val="single" w:color="BFBFBF" w:sz="4"/>
+              <w:left w:val="single" w:color="BFBFBF" w:sz="4"/>
+              <w:bottom w:val="single" w:color="BFBFBF" w:sz="4"/>
+              <w:right w:val="single" w:color="BFBFBF" w:sz="4"/>
+            </w:tcBorders>
+            <w:shd w:fill="F2F2F2" w:color="F2F2F2" w:val="clear"/>
+          </w:tcPr>
+          <w:p>
+            <w:pPr>
+              <w:spacing w:after="40" w:before="40"/>
+            </w:pPr>
+            <w:r>
+              <w:rPr>
+                <w:rFonts w:ascii="Arial" w:cs="Arial" w:eastAsia="Arial" w:hAnsi="Arial"/>
+                <w:sz w:val="18"/>
+                <w:szCs w:val="18"/>
+              </w:rPr>
+              <w:t xml:space="preserve">No</w:t>
+            </w:r>
+          </w:p>
+        </w:tc>
+        <w:tc>
+          <w:tcPr>
+            <w:tcW w:type="dxa" w:w="1685"/>
+            <w:tcBorders>
+              <w:top w:val="single" w:color="BFBFBF" w:sz="4"/>
+              <w:left w:val="single" w:color="BFBFBF" w:sz="4"/>
+              <w:bottom w:val="single" w:color="BFBFBF" w:sz="4"/>
+              <w:right w:val="single" w:color="BFBFBF" w:sz="4"/>
+            </w:tcBorders>
+            <w:shd w:fill="F2F2F2" w:color="F2F2F2" w:val="clear"/>
+          </w:tcPr>
+          <w:p>
+            <w:pPr>
+              <w:spacing w:after="40" w:before="40"/>
+            </w:pPr>
+            <w:r>
+              <w:rPr>
+                <w:rFonts w:ascii="Arial" w:cs="Arial" w:eastAsia="Arial" w:hAnsi="Arial"/>
+                <w:sz w:val="18"/>
+                <w:szCs w:val="18"/>
+              </w:rPr>
+              <w:t xml:space="preserve">No</w:t>
+            </w:r>
+          </w:p>
+        </w:tc>
+        <w:tc>
+          <w:tcPr>
+            <w:tcW w:type="dxa" w:w="1685"/>
+            <w:tcBorders>
+              <w:top w:val="single" w:color="BFBFBF" w:sz="4"/>
+              <w:left w:val="single" w:color="BFBFBF" w:sz="4"/>
+              <w:bottom w:val="single" w:color="BFBFBF" w:sz="4"/>
+              <w:right w:val="single" w:color="BFBFBF" w:sz="4"/>
+            </w:tcBorders>
+            <w:shd w:fill="F2F2F2" w:color="F2F2F2" w:val="clear"/>
+          </w:tcPr>
+          <w:p>
+            <w:pPr>
+              <w:spacing w:after="40" w:before="40"/>
+            </w:pPr>
+            <w:r>
+              <w:rPr>
+                <w:rFonts w:ascii="Arial" w:cs="Arial" w:eastAsia="Arial" w:hAnsi="Arial"/>
+                <w:sz w:val="18"/>
+                <w:szCs w:val="18"/>
+              </w:rPr>
+              <w:t xml:space="preserve">Yes</w:t>
+            </w:r>
+          </w:p>
+        </w:tc>
+      </w:tr>
+      <w:tr>
+        <w:tc>
+          <w:tcPr>
+            <w:tcW w:type="dxa" w:w="4306"/>
+            <w:tcBorders>
+              <w:top w:val="single" w:color="BFBFBF" w:sz="4"/>
+              <w:left w:val="single" w:color="BFBFBF" w:sz="4"/>
+              <w:bottom w:val="single" w:color="BFBFBF" w:sz="4"/>
+              <w:right w:val="single" w:color="BFBFBF" w:sz="4"/>
+            </w:tcBorders>
+            <w:shd w:fill="FFFFFF" w:color="FFFFFF" w:val="clear"/>
+          </w:tcPr>
+          <w:p>
+            <w:pPr>
+              <w:spacing w:after="40" w:before="40"/>
+            </w:pPr>
+            <w:r>
+              <w:rPr>
+                <w:rFonts w:ascii="Arial" w:cs="Arial" w:eastAsia="Arial" w:hAnsi="Arial"/>
+                <w:sz w:val="18"/>
+                <w:szCs w:val="18"/>
+              </w:rPr>
+              <w:t xml:space="preserve">Toggle docspace visibility (isPublic)</w:t>
+            </w:r>
+          </w:p>
+        </w:tc>
+        <w:tc>
+          <w:tcPr>
+            <w:tcW w:type="dxa" w:w="1685"/>
+            <w:tcBorders>
+              <w:top w:val="single" w:color="BFBFBF" w:sz="4"/>
+              <w:left w:val="single" w:color="BFBFBF" w:sz="4"/>
+              <w:bottom w:val="single" w:color="BFBFBF" w:sz="4"/>
+              <w:right w:val="single" w:color="BFBFBF" w:sz="4"/>
+            </w:tcBorders>
+            <w:shd w:fill="FFFFFF" w:color="FFFFFF" w:val="clear"/>
+          </w:tcPr>
+          <w:p>
+            <w:pPr>
+              <w:spacing w:after="40" w:before="40"/>
+            </w:pPr>
+            <w:r>
+              <w:rPr>
+                <w:rFonts w:ascii="Arial" w:cs="Arial" w:eastAsia="Arial" w:hAnsi="Arial"/>
+                <w:sz w:val="18"/>
+                <w:szCs w:val="18"/>
+              </w:rPr>
+              <w:t xml:space="preserve">No</w:t>
+            </w:r>
+          </w:p>
+        </w:tc>
+        <w:tc>
+          <w:tcPr>
+            <w:tcW w:type="dxa" w:w="1685"/>
+            <w:tcBorders>
+              <w:top w:val="single" w:color="BFBFBF" w:sz="4"/>
+              <w:left w:val="single" w:color="BFBFBF" w:sz="4"/>
+              <w:bottom w:val="single" w:color="BFBFBF" w:sz="4"/>
+              <w:right w:val="single" w:color="BFBFBF" w:sz="4"/>
+            </w:tcBorders>
+            <w:shd w:fill="FFFFFF" w:color="FFFFFF" w:val="clear"/>
+          </w:tcPr>
+          <w:p>
+            <w:pPr>
+              <w:spacing w:after="40" w:before="40"/>
+            </w:pPr>
+            <w:r>
+              <w:rPr>
+                <w:rFonts w:ascii="Arial" w:cs="Arial" w:eastAsia="Arial" w:hAnsi="Arial"/>
+                <w:sz w:val="18"/>
+                <w:szCs w:val="18"/>
+              </w:rPr>
+              <w:t xml:space="preserve">No</w:t>
             </w:r>
           </w:p>
         </w:tc>
@@ -11964,25 +12616,6 @@
           <w:szCs w:val="20"/>
         </w:rPr>
         <w:t xml:space="preserve">Subscription billing (Stripe — Subscription model already in schema)</w:t>
-      </w:r>
-    </w:p>
-    <w:p>
-      <w:pPr>
-        <w:pStyle w:val="ListParagraph"/>
-        <w:numPr>
-          <w:ilvl w:val="0"/>
-          <w:numId w:val="2"/>
-        </w:numPr>
-        <w:spacing w:after="20" w:before="20"/>
-        <w:ind w:left="360" w:hanging="360"/>
-      </w:pPr>
-      <w:r>
-        <w:rPr>
-          <w:rFonts w:ascii="Arial" w:cs="Arial" w:eastAsia="Arial" w:hAnsi="Arial"/>
-          <w:sz w:val="20"/>
-          <w:szCs w:val="20"/>
-        </w:rPr>
-        <w:t xml:space="preserve">DocSpace public visibility toggle (isPublic field already in schema)</w:t>
       </w:r>
     </w:p>
     <w:p>

</xml_diff>

<commit_message>
chore: drop dead Board/Column models, refresh functional spec (JFR-107)
Board and Column were unused dead code (prisma.board/prisma.column were
never called in src/). Also regenerates the v2.0 functional spec to
correct stale content: Archive->isClosed, IssueStatus->ProjectStatus,
document session invalidation and Custom Fields.

Co-Authored-By: Claude Sonnet 5 <noreply@anthropic.com>
</commit_message>
<xml_diff>
--- a/.context-docs/JedForge-FunctionalSpec-v2.0.docx
+++ b/.context-docs/JedForge-FunctionalSpec-v2.0.docx
@@ -741,6 +741,25 @@
           <w:szCs w:val="20"/>
         </w:rPr>
         <w:t xml:space="preserve">SSE status updated — still planned, not yet implemented</w:t>
+      </w:r>
+    </w:p>
+    <w:p>
+      <w:pPr>
+        <w:pStyle w:val="ListParagraph"/>
+        <w:numPr>
+          <w:ilvl w:val="0"/>
+          <w:numId w:val="2"/>
+        </w:numPr>
+        <w:spacing w:after="20" w:before="20"/>
+        <w:ind w:left="360" w:hanging="360"/>
+      </w:pPr>
+      <w:r>
+        <w:rPr>
+          <w:rFonts w:ascii="Arial" w:cs="Arial" w:eastAsia="Arial" w:hAnsi="Arial"/>
+          <w:sz w:val="20"/>
+          <w:szCs w:val="20"/>
+        </w:rPr>
+        <w:t xml:space="preserve">JFR-107 housekeeping pass: Archive→isClosed terminology corrected, IssueStatus enum replaced with ProjectStatus/StatusCategory throughout, session invalidation (sessionVersion) documented, Custom Fields documented, dead Board/Column models removed from the schema and this spec</w:t>
       </w:r>
     </w:p>
     <w:p>
@@ -2626,6 +2645,127 @@
     </w:p>
     <w:p>
       <w:pPr>
+        <w:pStyle w:val="Heading3"/>
+        <w:spacing w:after="60" w:before="160"/>
+        <w:outlineLvl w:val="2"/>
+      </w:pPr>
+      <w:r>
+        <w:rPr>
+          <w:rFonts w:ascii="Arial" w:cs="Arial" w:eastAsia="Arial" w:hAnsi="Arial"/>
+          <w:b/>
+          <w:bCs/>
+          <w:sz w:val="22"/>
+          <w:szCs w:val="22"/>
+        </w:rPr>
+        <w:t xml:space="preserve">Session Invalidation</w:t>
+      </w:r>
+    </w:p>
+    <w:p>
+      <w:pPr>
+        <w:pStyle w:val="ListParagraph"/>
+        <w:numPr>
+          <w:ilvl w:val="0"/>
+          <w:numId w:val="2"/>
+        </w:numPr>
+        <w:spacing w:after="20" w:before="20"/>
+        <w:ind w:left="360" w:hanging="360"/>
+      </w:pPr>
+      <w:r>
+        <w:rPr>
+          <w:rFonts w:ascii="Arial" w:cs="Arial" w:eastAsia="Arial" w:hAnsi="Arial"/>
+          <w:sz w:val="20"/>
+          <w:szCs w:val="20"/>
+        </w:rPr>
+        <w:t xml:space="preserve">User.sessionVersion (Int, default 1) is a monotonically increasing counter checked on every auth() call.</w:t>
+      </w:r>
+    </w:p>
+    <w:p>
+      <w:pPr>
+        <w:pStyle w:val="ListParagraph"/>
+        <w:numPr>
+          <w:ilvl w:val="0"/>
+          <w:numId w:val="2"/>
+        </w:numPr>
+        <w:spacing w:after="20" w:before="20"/>
+        <w:ind w:left="360" w:hanging="360"/>
+      </w:pPr>
+      <w:r>
+        <w:rPr>
+          <w:rFonts w:ascii="Arial" w:cs="Arial" w:eastAsia="Arial" w:hAnsi="Arial"/>
+          <w:sz w:val="20"/>
+          <w:szCs w:val="20"/>
+        </w:rPr>
+        <w:t xml:space="preserve">The JWT callback fetches the current DB value each request and sets token.invalidated = true if it no longer matches the token — getCurrentUser() then returns null, so requireAuth/requireAdmin and page-layout guards treat the session as logged out on its next request.</w:t>
+      </w:r>
+    </w:p>
+    <w:p>
+      <w:pPr>
+        <w:pStyle w:val="ListParagraph"/>
+        <w:numPr>
+          <w:ilvl w:val="0"/>
+          <w:numId w:val="2"/>
+        </w:numPr>
+        <w:spacing w:after="20" w:before="20"/>
+        <w:ind w:left="360" w:hanging="360"/>
+      </w:pPr>
+      <w:r>
+        <w:rPr>
+          <w:rFonts w:ascii="Arial" w:cs="Arial" w:eastAsia="Arial" w:hAnsi="Arial"/>
+          <w:sz w:val="20"/>
+          <w:szCs w:val="20"/>
+        </w:rPr>
+        <w:t xml:space="preserve">Three events bump the counter: adminResetUserPassword, adminUpdateUser (role changes only), and self-service changePassword.</w:t>
+      </w:r>
+    </w:p>
+    <w:p>
+      <w:pPr>
+        <w:pStyle w:val="ListParagraph"/>
+        <w:numPr>
+          <w:ilvl w:val="0"/>
+          <w:numId w:val="2"/>
+        </w:numPr>
+        <w:spacing w:after="20" w:before="20"/>
+        <w:ind w:left="360" w:hanging="360"/>
+      </w:pPr>
+      <w:r>
+        <w:rPr>
+          <w:rFonts w:ascii="Arial" w:cs="Arial" w:eastAsia="Arial" w:hAnsi="Arial"/>
+          <w:sz w:val="20"/>
+          <w:szCs w:val="20"/>
+        </w:rPr>
+        <w:t xml:space="preserve">After a self-service password change, the client calls session.update(), which re-arms the active browser’s token by syncing its version forward — keeping that session logged in while all other sessions for the user are invalidated.</w:t>
+      </w:r>
+    </w:p>
+    <w:p>
+      <w:pPr>
+        <w:spacing w:after="60" w:before="60"/>
+        <w:ind w:left="360"/>
+      </w:pPr>
+      <w:r>
+        <w:rPr>
+          <w:rFonts w:ascii="Arial" w:cs="Arial" w:eastAsia="Arial" w:hAnsi="Arial"/>
+          <w:b/>
+          <w:bCs/>
+          <w:color w:val="C55A11"/>
+          <w:sz w:val="18"/>
+          <w:szCs w:val="18"/>
+        </w:rPr>
+        <w:t xml:space="preserve">⚠ Note: </w:t>
+      </w:r>
+      <w:r>
+        <w:rPr>
+          <w:rFonts w:ascii="Arial" w:cs="Arial" w:eastAsia="Arial" w:hAnsi="Arial"/>
+          <w:i/>
+          <w:iCs/>
+          <w:color w:val="595959"/>
+          <w:sz w:val="18"/>
+          <w:szCs w:val="18"/>
+        </w:rPr>
+        <w:t xml:space="preserve">Invalidation is enforced at the server-component/server-action layer, not at Edge middleware — Prisma cannot run in the Edge runtime. An invalidated session still passes the middleware’s auth check but is caught by getCurrentUser() on the first subsequent server call.</w:t>
+      </w:r>
+    </w:p>
+    <w:p>
+      <w:pPr>
         <w:pStyle w:val="Heading2"/>
         <w:spacing w:after="80" w:before="200"/>
         <w:outlineLvl w:val="1"/>
@@ -2731,7 +2871,7 @@
           <w:sz w:val="20"/>
           <w:szCs w:val="20"/>
         </w:rPr>
-        <w:t xml:space="preserve">Status — fixed 4-value enum: TODO, IN_PROGRESS, IN_REVIEW, DONE</w:t>
+        <w:t xml:space="preserve">Status — FK to a ProjectStatus row (per-project, admin-configurable name/position; each status carries a StatusCategory of TODO | IN_PROGRESS | DONE for board-column grouping)</w:t>
       </w:r>
     </w:p>
     <w:p>
@@ -3027,6 +3167,98 @@
           <w:szCs w:val="20"/>
         </w:rPr>
         <w:t xml:space="preserve">Every field change on an issue is recorded as an ActivityLog entry with action, field, oldValue, newValue, userId, and timestamp. The activity feed is visible on the issue detail view.</w:t>
+      </w:r>
+    </w:p>
+    <w:p>
+      <w:pPr>
+        <w:pStyle w:val="Heading3"/>
+        <w:spacing w:after="60" w:before="160"/>
+        <w:outlineLvl w:val="2"/>
+      </w:pPr>
+      <w:r>
+        <w:rPr>
+          <w:rFonts w:ascii="Arial" w:cs="Arial" w:eastAsia="Arial" w:hAnsi="Arial"/>
+          <w:b/>
+          <w:bCs/>
+          <w:sz w:val="22"/>
+          <w:szCs w:val="22"/>
+        </w:rPr>
+        <w:t xml:space="preserve">Custom Fields</w:t>
+      </w:r>
+    </w:p>
+    <w:p>
+      <w:pPr>
+        <w:spacing w:after="40" w:before="40"/>
+        <w:jc w:val="left"/>
+      </w:pPr>
+      <w:r>
+        <w:rPr>
+          <w:rFonts w:ascii="Arial" w:cs="Arial" w:eastAsia="Arial" w:hAnsi="Arial"/>
+          <w:b w:val="false"/>
+          <w:bCs w:val="false"/>
+          <w:i w:val="false"/>
+          <w:iCs w:val="false"/>
+          <w:sz w:val="20"/>
+          <w:szCs w:val="20"/>
+        </w:rPr>
+        <w:t xml:space="preserve">Organizations can define custom fields (CustomField model) scoped at the org level, then restrict which projects expose each field via CustomFieldProject.</w:t>
+      </w:r>
+    </w:p>
+    <w:p>
+      <w:pPr>
+        <w:pStyle w:val="ListParagraph"/>
+        <w:numPr>
+          <w:ilvl w:val="0"/>
+          <w:numId w:val="2"/>
+        </w:numPr>
+        <w:spacing w:after="20" w:before="20"/>
+        <w:ind w:left="360" w:hanging="360"/>
+      </w:pPr>
+      <w:r>
+        <w:rPr>
+          <w:rFonts w:ascii="Arial" w:cs="Arial" w:eastAsia="Arial" w:hAnsi="Arial"/>
+          <w:sz w:val="20"/>
+          <w:szCs w:val="20"/>
+        </w:rPr>
+        <w:t xml:space="preserve">Field types (CustomFieldType): text, number, date, boolean, single-select, and multi-select.</w:t>
+      </w:r>
+    </w:p>
+    <w:p>
+      <w:pPr>
+        <w:pStyle w:val="ListParagraph"/>
+        <w:numPr>
+          <w:ilvl w:val="0"/>
+          <w:numId w:val="2"/>
+        </w:numPr>
+        <w:spacing w:after="20" w:before="20"/>
+        <w:ind w:left="360" w:hanging="360"/>
+      </w:pPr>
+      <w:r>
+        <w:rPr>
+          <w:rFonts w:ascii="Arial" w:cs="Arial" w:eastAsia="Arial" w:hAnsi="Arial"/>
+          <w:sz w:val="20"/>
+          <w:szCs w:val="20"/>
+        </w:rPr>
+        <w:t xml:space="preserve">CustomFieldValue stores one typed value per (customField, issue) pair — textValue, numberValue, dateValue, boolValue, selectValue, or multiValues[] depending on the field type.</w:t>
+      </w:r>
+    </w:p>
+    <w:p>
+      <w:pPr>
+        <w:pStyle w:val="ListParagraph"/>
+        <w:numPr>
+          <w:ilvl w:val="0"/>
+          <w:numId w:val="2"/>
+        </w:numPr>
+        <w:spacing w:after="20" w:before="20"/>
+        <w:ind w:left="360" w:hanging="360"/>
+      </w:pPr>
+      <w:r>
+        <w:rPr>
+          <w:rFonts w:ascii="Arial" w:cs="Arial" w:eastAsia="Arial" w:hAnsi="Arial"/>
+          <w:sz w:val="20"/>
+          <w:szCs w:val="20"/>
+        </w:rPr>
+        <w:t xml:space="preserve">Custom fields render on the issue detail view alongside built-in fields once a project opts in via CustomFieldProject.</w:t>
       </w:r>
     </w:p>
     <w:p>
@@ -3063,7 +3295,7 @@
           <w:sz w:val="20"/>
           <w:szCs w:val="20"/>
         </w:rPr>
-        <w:t xml:space="preserve">Issues are displayed as cards within status columns (one column per IssueStatus value).</w:t>
+        <w:t xml:space="preserve">Issues are displayed as cards within status columns (one column per ProjectStatus row, ordered by category then position).</w:t>
       </w:r>
     </w:p>
     <w:p>
@@ -3101,6 +3333,25 @@
           <w:sz w:val="20"/>
           <w:szCs w:val="20"/>
         </w:rPr>
+        <w:t xml:space="preserve">Statuses themselves are admin-configurable per project (BoardSettings.tsx): add, rename, delete, and reorder ProjectStatus rows within a StatusCategory.</w:t>
+      </w:r>
+    </w:p>
+    <w:p>
+      <w:pPr>
+        <w:pStyle w:val="ListParagraph"/>
+        <w:numPr>
+          <w:ilvl w:val="0"/>
+          <w:numId w:val="2"/>
+        </w:numPr>
+        <w:spacing w:after="20" w:before="20"/>
+        <w:ind w:left="360" w:hanging="360"/>
+      </w:pPr>
+      <w:r>
+        <w:rPr>
+          <w:rFonts w:ascii="Arial" w:cs="Arial" w:eastAsia="Arial" w:hAnsi="Arial"/>
+          <w:sz w:val="20"/>
+          <w:szCs w:val="20"/>
+        </w:rPr>
         <w:t xml:space="preserve">Drag-and-drop is implemented with @dnd-kit (core + sortable packages).</w:t>
       </w:r>
     </w:p>
@@ -3140,25 +3391,6 @@
           <w:szCs w:val="20"/>
         </w:rPr>
         <w:t xml:space="preserve">Board updates fall back to polling (AutoRefresh component, 3-minute interval) for changes made by other users.</w:t>
-      </w:r>
-    </w:p>
-    <w:p>
-      <w:pPr>
-        <w:pStyle w:val="ListParagraph"/>
-        <w:numPr>
-          <w:ilvl w:val="0"/>
-          <w:numId w:val="2"/>
-        </w:numPr>
-        <w:spacing w:after="20" w:before="20"/>
-        <w:ind w:left="360" w:hanging="360"/>
-      </w:pPr>
-      <w:r>
-        <w:rPr>
-          <w:rFonts w:ascii="Arial" w:cs="Arial" w:eastAsia="Arial" w:hAnsi="Arial"/>
-          <w:sz w:val="20"/>
-          <w:szCs w:val="20"/>
-        </w:rPr>
-        <w:t xml:space="preserve">Board and Column models exist in the schema for a future custom workflow system but are not yet wired to the Kanban renderer.</w:t>
       </w:r>
     </w:p>
     <w:p>
@@ -5531,7 +5763,7 @@
           <w:sz w:val="20"/>
           <w:szCs w:val="20"/>
         </w:rPr>
-        <w:t xml:space="preserve">Projects can be archived.</w:t>
+        <w:t xml:space="preserve">Projects can be closed by an Admin (isClosed) — the only deactivation mechanism; there is no separate Archive concept. Closed projects drop off the main Projects page, Dashboard, and closed-project URLs redirect non-admins, except the Docs module which remains accessible.</w:t>
       </w:r>
     </w:p>
     <w:p>
@@ -6228,7 +6460,7 @@
                 <w:sz w:val="18"/>
                 <w:szCs w:val="18"/>
               </w:rPr>
-              <w:t xml:space="preserve">id, name, key (unique), orgId, isPrivate, isArchived</w:t>
+              <w:t xml:space="preserve">id, name, key (unique), orgId, isPrivate, isClosed</w:t>
             </w:r>
           </w:p>
         </w:tc>
@@ -6253,7 +6485,7 @@
                 <w:sz w:val="18"/>
                 <w:szCs w:val="18"/>
               </w:rPr>
-              <w:t xml:space="preserve">Belongs to one Organization</w:t>
+              <w:t xml:space="preserve">Belongs to one Organization. isClosed: admin-only close/reopen — there is no Archive concept.</w:t>
             </w:r>
           </w:p>
         </w:tc>
@@ -6382,7 +6614,7 @@
                 <w:sz w:val="18"/>
                 <w:szCs w:val="18"/>
               </w:rPr>
-              <w:t xml:space="preserve">id, key (unique), title, description, status, priority, type, assigneeId, reporterId, parentId, position, labels[], dueDate</w:t>
+              <w:t xml:space="preserve">id, key (unique), title, description, statusId, priority, type, assigneeId, reporterId, parentId, position, labels[], dueDate</w:t>
             </w:r>
           </w:p>
         </w:tc>
@@ -6407,7 +6639,7 @@
                 <w:sz w:val="18"/>
                 <w:szCs w:val="18"/>
               </w:rPr>
-              <w:t xml:space="preserve">status: IssueStatus enum. priority: IssuePriority enum. type: IssueType enum.</w:t>
+              <w:t xml:space="preserve">statusId: FK to ProjectStatus. priority: IssuePriority enum. type: IssueType enum.</w:t>
             </w:r>
           </w:p>
         </w:tc>
@@ -6434,7 +6666,7 @@
                 <w:sz w:val="18"/>
                 <w:szCs w:val="18"/>
               </w:rPr>
-              <w:t xml:space="preserve">Comment</w:t>
+              <w:t xml:space="preserve">ProjectStatus</w:t>
             </w:r>
           </w:p>
         </w:tc>
@@ -6459,7 +6691,7 @@
                 <w:sz w:val="18"/>
                 <w:szCs w:val="18"/>
               </w:rPr>
-              <w:t xml:space="preserve">id, issueId, authorId, body, createdAt, updatedAt</w:t>
+              <w:t xml:space="preserve">id, projectId, name, category (StatusCategory), position, isDefault</w:t>
             </w:r>
           </w:p>
         </w:tc>
@@ -6484,7 +6716,7 @@
                 <w:sz w:val="18"/>
                 <w:szCs w:val="18"/>
               </w:rPr>
-              <w:t xml:space="preserve">TipTap HTML in body field</w:t>
+              <w:t xml:space="preserve">Per-project, admin-configurable Kanban column. Replaces the old fixed IssueStatus enum. Unique (projectId, name).</w:t>
             </w:r>
           </w:p>
         </w:tc>
@@ -6511,7 +6743,7 @@
                 <w:sz w:val="18"/>
                 <w:szCs w:val="18"/>
               </w:rPr>
-              <w:t xml:space="preserve">ActivityLog</w:t>
+              <w:t xml:space="preserve">Comment</w:t>
             </w:r>
           </w:p>
         </w:tc>
@@ -6536,7 +6768,7 @@
                 <w:sz w:val="18"/>
                 <w:szCs w:val="18"/>
               </w:rPr>
-              <w:t xml:space="preserve">id, issueId, userId, action, field, oldValue, newValue</w:t>
+              <w:t xml:space="preserve">id, issueId, authorId, body, createdAt, updatedAt</w:t>
             </w:r>
           </w:p>
         </w:tc>
@@ -6561,7 +6793,7 @@
                 <w:sz w:val="18"/>
                 <w:szCs w:val="18"/>
               </w:rPr>
-              <w:t xml:space="preserve">Append-only audit trail per issue</w:t>
+              <w:t xml:space="preserve">TipTap HTML in body field</w:t>
             </w:r>
           </w:p>
         </w:tc>
@@ -6588,7 +6820,7 @@
                 <w:sz w:val="18"/>
                 <w:szCs w:val="18"/>
               </w:rPr>
-              <w:t xml:space="preserve">Attachment</w:t>
+              <w:t xml:space="preserve">ActivityLog</w:t>
             </w:r>
           </w:p>
         </w:tc>
@@ -6613,7 +6845,7 @@
                 <w:sz w:val="18"/>
                 <w:szCs w:val="18"/>
               </w:rPr>
-              <w:t xml:space="preserve">id, issueId, uploaderId, fileName, fileKey, fileSize, mimeType</w:t>
+              <w:t xml:space="preserve">id, issueId, userId, action, field, oldValue, newValue</w:t>
             </w:r>
           </w:p>
         </w:tc>
@@ -6638,7 +6870,7 @@
                 <w:sz w:val="18"/>
                 <w:szCs w:val="18"/>
               </w:rPr>
-              <w:t xml:space="preserve">S3 fileKey; download via presigned URL</w:t>
+              <w:t xml:space="preserve">Append-only audit trail per issue</w:t>
             </w:r>
           </w:p>
         </w:tc>
@@ -6665,7 +6897,7 @@
                 <w:sz w:val="18"/>
                 <w:szCs w:val="18"/>
               </w:rPr>
-              <w:t xml:space="preserve">SavedFilter</w:t>
+              <w:t xml:space="preserve">Attachment</w:t>
             </w:r>
           </w:p>
         </w:tc>
@@ -6690,7 +6922,7 @@
                 <w:sz w:val="18"/>
                 <w:szCs w:val="18"/>
               </w:rPr>
-              <w:t xml:space="preserve">id, userId, name, query, isGlobal</w:t>
+              <w:t xml:space="preserve">id, issueId, uploaderId, fileName, fileKey, fileSize, mimeType</w:t>
             </w:r>
           </w:p>
         </w:tc>
@@ -6715,7 +6947,7 @@
                 <w:sz w:val="18"/>
                 <w:szCs w:val="18"/>
               </w:rPr>
-              <w:t xml:space="preserve">FQL query string; isGlobal shares with all project users</w:t>
+              <w:t xml:space="preserve">S3 fileKey; download via presigned URL</w:t>
             </w:r>
           </w:p>
         </w:tc>
@@ -6742,7 +6974,7 @@
                 <w:sz w:val="18"/>
                 <w:szCs w:val="18"/>
               </w:rPr>
-              <w:t xml:space="preserve">Notification</w:t>
+              <w:t xml:space="preserve">SavedFilter</w:t>
             </w:r>
           </w:p>
         </w:tc>
@@ -6767,7 +6999,7 @@
                 <w:sz w:val="18"/>
                 <w:szCs w:val="18"/>
               </w:rPr>
-              <w:t xml:space="preserve">id, type (NotificationType), message, userId, issueId, read</w:t>
+              <w:t xml:space="preserve">id, userId, name, query, isGlobal</w:t>
             </w:r>
           </w:p>
         </w:tc>
@@ -6792,7 +7024,7 @@
                 <w:sz w:val="18"/>
                 <w:szCs w:val="18"/>
               </w:rPr>
-              <w:t xml:space="preserve">Types: ISSUE_ASSIGNED | COMMENT_ADDED | STATUS_CHANGED | MENTION</w:t>
+              <w:t xml:space="preserve">FQL query string; isGlobal shares with all project users</w:t>
             </w:r>
           </w:p>
         </w:tc>
@@ -6819,7 +7051,7 @@
                 <w:sz w:val="18"/>
                 <w:szCs w:val="18"/>
               </w:rPr>
-              <w:t xml:space="preserve">Board</w:t>
+              <w:t xml:space="preserve">Notification</w:t>
             </w:r>
           </w:p>
         </w:tc>
@@ -6844,7 +7076,7 @@
                 <w:sz w:val="18"/>
                 <w:szCs w:val="18"/>
               </w:rPr>
-              <w:t xml:space="preserve">id, projectId, name</w:t>
+              <w:t xml:space="preserve">id, type (NotificationType), message, userId, issueId, read</w:t>
             </w:r>
           </w:p>
         </w:tc>
@@ -6869,7 +7101,7 @@
                 <w:sz w:val="18"/>
                 <w:szCs w:val="18"/>
               </w:rPr>
-              <w:t xml:space="preserve">Exists for future custom workflow system; not yet wired to Kanban renderer</w:t>
+              <w:t xml:space="preserve">Types: ISSUE_ASSIGNED | COMMENT_ADDED | STATUS_CHANGED | MENTION</w:t>
             </w:r>
           </w:p>
         </w:tc>
@@ -6896,7 +7128,7 @@
                 <w:sz w:val="18"/>
                 <w:szCs w:val="18"/>
               </w:rPr>
-              <w:t xml:space="preserve">Column</w:t>
+              <w:t xml:space="preserve">CustomField</w:t>
             </w:r>
           </w:p>
         </w:tc>
@@ -6921,7 +7153,7 @@
                 <w:sz w:val="18"/>
                 <w:szCs w:val="18"/>
               </w:rPr>
-              <w:t xml:space="preserve">id, boardId, name, position, color</w:t>
+              <w:t xml:space="preserve">id, orgId, name, type (CustomFieldType), options[], position</w:t>
             </w:r>
           </w:p>
         </w:tc>
@@ -6946,7 +7178,161 @@
                 <w:sz w:val="18"/>
                 <w:szCs w:val="18"/>
               </w:rPr>
-              <w:t xml:space="preserve">Child of Board</w:t>
+              <w:t xml:space="preserve">Org-scoped field definition. Unique (orgId, name).</w:t>
+            </w:r>
+          </w:p>
+        </w:tc>
+      </w:tr>
+      <w:tr>
+        <w:tc>
+          <w:tcPr>
+            <w:tcW w:type="dxa" w:w="1404"/>
+            <w:tcBorders>
+              <w:top w:val="single" w:color="BFBFBF" w:sz="4"/>
+              <w:left w:val="single" w:color="BFBFBF" w:sz="4"/>
+              <w:bottom w:val="single" w:color="BFBFBF" w:sz="4"/>
+              <w:right w:val="single" w:color="BFBFBF" w:sz="4"/>
+            </w:tcBorders>
+            <w:shd w:fill="F2F2F2" w:color="F2F2F2" w:val="clear"/>
+          </w:tcPr>
+          <w:p>
+            <w:pPr>
+              <w:spacing w:after="40" w:before="40"/>
+            </w:pPr>
+            <w:r>
+              <w:rPr>
+                <w:rFonts w:ascii="Arial" w:cs="Arial" w:eastAsia="Arial" w:hAnsi="Arial"/>
+                <w:sz w:val="18"/>
+                <w:szCs w:val="18"/>
+              </w:rPr>
+              <w:t xml:space="preserve">CustomFieldProject</w:t>
+            </w:r>
+          </w:p>
+        </w:tc>
+        <w:tc>
+          <w:tcPr>
+            <w:tcW w:type="dxa" w:w="2808"/>
+            <w:tcBorders>
+              <w:top w:val="single" w:color="BFBFBF" w:sz="4"/>
+              <w:left w:val="single" w:color="BFBFBF" w:sz="4"/>
+              <w:bottom w:val="single" w:color="BFBFBF" w:sz="4"/>
+              <w:right w:val="single" w:color="BFBFBF" w:sz="4"/>
+            </w:tcBorders>
+            <w:shd w:fill="F2F2F2" w:color="F2F2F2" w:val="clear"/>
+          </w:tcPr>
+          <w:p>
+            <w:pPr>
+              <w:spacing w:after="40" w:before="40"/>
+            </w:pPr>
+            <w:r>
+              <w:rPr>
+                <w:rFonts w:ascii="Arial" w:cs="Arial" w:eastAsia="Arial" w:hAnsi="Arial"/>
+                <w:sz w:val="18"/>
+                <w:szCs w:val="18"/>
+              </w:rPr>
+              <w:t xml:space="preserve">id, customFieldId, projectId</w:t>
+            </w:r>
+          </w:p>
+        </w:tc>
+        <w:tc>
+          <w:tcPr>
+            <w:tcW w:type="dxa" w:w="5148"/>
+            <w:tcBorders>
+              <w:top w:val="single" w:color="BFBFBF" w:sz="4"/>
+              <w:left w:val="single" w:color="BFBFBF" w:sz="4"/>
+              <w:bottom w:val="single" w:color="BFBFBF" w:sz="4"/>
+              <w:right w:val="single" w:color="BFBFBF" w:sz="4"/>
+            </w:tcBorders>
+            <w:shd w:fill="F2F2F2" w:color="F2F2F2" w:val="clear"/>
+          </w:tcPr>
+          <w:p>
+            <w:pPr>
+              <w:spacing w:after="40" w:before="40"/>
+            </w:pPr>
+            <w:r>
+              <w:rPr>
+                <w:rFonts w:ascii="Arial" w:cs="Arial" w:eastAsia="Arial" w:hAnsi="Arial"/>
+                <w:sz w:val="18"/>
+                <w:szCs w:val="18"/>
+              </w:rPr>
+              <w:t xml:space="preserve">Junction table — restricts which projects expose a CustomField. Unique (customFieldId, projectId).</w:t>
+            </w:r>
+          </w:p>
+        </w:tc>
+      </w:tr>
+      <w:tr>
+        <w:tc>
+          <w:tcPr>
+            <w:tcW w:type="dxa" w:w="1404"/>
+            <w:tcBorders>
+              <w:top w:val="single" w:color="BFBFBF" w:sz="4"/>
+              <w:left w:val="single" w:color="BFBFBF" w:sz="4"/>
+              <w:bottom w:val="single" w:color="BFBFBF" w:sz="4"/>
+              <w:right w:val="single" w:color="BFBFBF" w:sz="4"/>
+            </w:tcBorders>
+            <w:shd w:fill="FFFFFF" w:color="FFFFFF" w:val="clear"/>
+          </w:tcPr>
+          <w:p>
+            <w:pPr>
+              <w:spacing w:after="40" w:before="40"/>
+            </w:pPr>
+            <w:r>
+              <w:rPr>
+                <w:rFonts w:ascii="Arial" w:cs="Arial" w:eastAsia="Arial" w:hAnsi="Arial"/>
+                <w:sz w:val="18"/>
+                <w:szCs w:val="18"/>
+              </w:rPr>
+              <w:t xml:space="preserve">CustomFieldValue</w:t>
+            </w:r>
+          </w:p>
+        </w:tc>
+        <w:tc>
+          <w:tcPr>
+            <w:tcW w:type="dxa" w:w="2808"/>
+            <w:tcBorders>
+              <w:top w:val="single" w:color="BFBFBF" w:sz="4"/>
+              <w:left w:val="single" w:color="BFBFBF" w:sz="4"/>
+              <w:bottom w:val="single" w:color="BFBFBF" w:sz="4"/>
+              <w:right w:val="single" w:color="BFBFBF" w:sz="4"/>
+            </w:tcBorders>
+            <w:shd w:fill="FFFFFF" w:color="FFFFFF" w:val="clear"/>
+          </w:tcPr>
+          <w:p>
+            <w:pPr>
+              <w:spacing w:after="40" w:before="40"/>
+            </w:pPr>
+            <w:r>
+              <w:rPr>
+                <w:rFonts w:ascii="Arial" w:cs="Arial" w:eastAsia="Arial" w:hAnsi="Arial"/>
+                <w:sz w:val="18"/>
+                <w:szCs w:val="18"/>
+              </w:rPr>
+              <w:t xml:space="preserve">id, customFieldId, issueId, textValue, numberValue, dateValue, boolValue, selectValue, multiValues[]</w:t>
+            </w:r>
+          </w:p>
+        </w:tc>
+        <w:tc>
+          <w:tcPr>
+            <w:tcW w:type="dxa" w:w="5148"/>
+            <w:tcBorders>
+              <w:top w:val="single" w:color="BFBFBF" w:sz="4"/>
+              <w:left w:val="single" w:color="BFBFBF" w:sz="4"/>
+              <w:bottom w:val="single" w:color="BFBFBF" w:sz="4"/>
+              <w:right w:val="single" w:color="BFBFBF" w:sz="4"/>
+            </w:tcBorders>
+            <w:shd w:fill="FFFFFF" w:color="FFFFFF" w:val="clear"/>
+          </w:tcPr>
+          <w:p>
+            <w:pPr>
+              <w:spacing w:after="40" w:before="40"/>
+            </w:pPr>
+            <w:r>
+              <w:rPr>
+                <w:rFonts w:ascii="Arial" w:cs="Arial" w:eastAsia="Arial" w:hAnsi="Arial"/>
+                <w:sz w:val="18"/>
+                <w:szCs w:val="18"/>
+              </w:rPr>
+              <w:t xml:space="preserve">One typed value per (customField, issue). Unique (customFieldId, issueId).</w:t>
             </w:r>
           </w:p>
         </w:tc>
@@ -7615,7 +8001,7 @@
                 <w:sz w:val="18"/>
                 <w:szCs w:val="18"/>
               </w:rPr>
-              <w:t xml:space="preserve">IssueStatus</w:t>
+              <w:t xml:space="preserve">StatusCategory</w:t>
             </w:r>
           </w:p>
         </w:tc>
@@ -7640,7 +8026,7 @@
                 <w:sz w:val="18"/>
                 <w:szCs w:val="18"/>
               </w:rPr>
-              <w:t xml:space="preserve">TODO | IN_PROGRESS | IN_REVIEW | DONE</w:t>
+              <w:t xml:space="preserve">TODO | IN_PROGRESS | DONE  (groups ProjectStatus rows for board-column layout)</w:t>
             </w:r>
           </w:p>
         </w:tc>
@@ -7875,7 +8261,7 @@
                 <w:sz w:val="18"/>
                 <w:szCs w:val="18"/>
               </w:rPr>
-              <w:t xml:space="preserve">Plan</w:t>
+              <w:t xml:space="preserve">CustomFieldType</w:t>
             </w:r>
           </w:p>
         </w:tc>
@@ -7900,7 +8286,7 @@
                 <w:sz w:val="18"/>
                 <w:szCs w:val="18"/>
               </w:rPr>
-              <w:t xml:space="preserve">FREE | PRO | TEAM</w:t>
+              <w:t xml:space="preserve">text | number | date | boolean | single-select | multi-select</w:t>
             </w:r>
           </w:p>
         </w:tc>
@@ -7927,6 +8313,58 @@
                 <w:sz w:val="18"/>
                 <w:szCs w:val="18"/>
               </w:rPr>
+              <w:t xml:space="preserve">Plan</w:t>
+            </w:r>
+          </w:p>
+        </w:tc>
+        <w:tc>
+          <w:tcPr>
+            <w:tcW w:type="dxa" w:w="7020"/>
+            <w:tcBorders>
+              <w:top w:val="single" w:color="BFBFBF" w:sz="4"/>
+              <w:left w:val="single" w:color="BFBFBF" w:sz="4"/>
+              <w:bottom w:val="single" w:color="BFBFBF" w:sz="4"/>
+              <w:right w:val="single" w:color="BFBFBF" w:sz="4"/>
+            </w:tcBorders>
+            <w:shd w:fill="F2F2F2" w:color="F2F2F2" w:val="clear"/>
+          </w:tcPr>
+          <w:p>
+            <w:pPr>
+              <w:spacing w:after="40" w:before="40"/>
+            </w:pPr>
+            <w:r>
+              <w:rPr>
+                <w:rFonts w:ascii="Arial" w:cs="Arial" w:eastAsia="Arial" w:hAnsi="Arial"/>
+                <w:sz w:val="18"/>
+                <w:szCs w:val="18"/>
+              </w:rPr>
+              <w:t xml:space="preserve">FREE | PRO | TEAM</w:t>
+            </w:r>
+          </w:p>
+        </w:tc>
+      </w:tr>
+      <w:tr>
+        <w:tc>
+          <w:tcPr>
+            <w:tcW w:type="dxa" w:w="2340"/>
+            <w:tcBorders>
+              <w:top w:val="single" w:color="BFBFBF" w:sz="4"/>
+              <w:left w:val="single" w:color="BFBFBF" w:sz="4"/>
+              <w:bottom w:val="single" w:color="BFBFBF" w:sz="4"/>
+              <w:right w:val="single" w:color="BFBFBF" w:sz="4"/>
+            </w:tcBorders>
+            <w:shd w:fill="FFFFFF" w:color="FFFFFF" w:val="clear"/>
+          </w:tcPr>
+          <w:p>
+            <w:pPr>
+              <w:spacing w:after="40" w:before="40"/>
+            </w:pPr>
+            <w:r>
+              <w:rPr>
+                <w:rFonts w:ascii="Arial" w:cs="Arial" w:eastAsia="Arial" w:hAnsi="Arial"/>
+                <w:sz w:val="18"/>
+                <w:szCs w:val="18"/>
+              </w:rPr>
               <w:t xml:space="preserve">SubscriptionStatus</w:t>
             </w:r>
           </w:p>
@@ -7940,7 +8378,7 @@
               <w:bottom w:val="single" w:color="BFBFBF" w:sz="4"/>
               <w:right w:val="single" w:color="BFBFBF" w:sz="4"/>
             </w:tcBorders>
-            <w:shd w:fill="F2F2F2" w:color="F2F2F2" w:val="clear"/>
+            <w:shd w:fill="FFFFFF" w:color="FFFFFF" w:val="clear"/>
           </w:tcPr>
           <w:p>
             <w:pPr>
@@ -8988,6 +9426,108 @@
                 <w:sz w:val="18"/>
                 <w:szCs w:val="18"/>
               </w:rPr>
+              <w:t xml:space="preserve">Close / reopen projects (isClosed)</w:t>
+            </w:r>
+          </w:p>
+        </w:tc>
+        <w:tc>
+          <w:tcPr>
+            <w:tcW w:type="dxa" w:w="1685"/>
+            <w:tcBorders>
+              <w:top w:val="single" w:color="BFBFBF" w:sz="4"/>
+              <w:left w:val="single" w:color="BFBFBF" w:sz="4"/>
+              <w:bottom w:val="single" w:color="BFBFBF" w:sz="4"/>
+              <w:right w:val="single" w:color="BFBFBF" w:sz="4"/>
+            </w:tcBorders>
+            <w:shd w:fill="FFFFFF" w:color="FFFFFF" w:val="clear"/>
+          </w:tcPr>
+          <w:p>
+            <w:pPr>
+              <w:spacing w:after="40" w:before="40"/>
+            </w:pPr>
+            <w:r>
+              <w:rPr>
+                <w:rFonts w:ascii="Arial" w:cs="Arial" w:eastAsia="Arial" w:hAnsi="Arial"/>
+                <w:sz w:val="18"/>
+                <w:szCs w:val="18"/>
+              </w:rPr>
+              <w:t xml:space="preserve">No</w:t>
+            </w:r>
+          </w:p>
+        </w:tc>
+        <w:tc>
+          <w:tcPr>
+            <w:tcW w:type="dxa" w:w="1685"/>
+            <w:tcBorders>
+              <w:top w:val="single" w:color="BFBFBF" w:sz="4"/>
+              <w:left w:val="single" w:color="BFBFBF" w:sz="4"/>
+              <w:bottom w:val="single" w:color="BFBFBF" w:sz="4"/>
+              <w:right w:val="single" w:color="BFBFBF" w:sz="4"/>
+            </w:tcBorders>
+            <w:shd w:fill="FFFFFF" w:color="FFFFFF" w:val="clear"/>
+          </w:tcPr>
+          <w:p>
+            <w:pPr>
+              <w:spacing w:after="40" w:before="40"/>
+            </w:pPr>
+            <w:r>
+              <w:rPr>
+                <w:rFonts w:ascii="Arial" w:cs="Arial" w:eastAsia="Arial" w:hAnsi="Arial"/>
+                <w:sz w:val="18"/>
+                <w:szCs w:val="18"/>
+              </w:rPr>
+              <w:t xml:space="preserve">No</w:t>
+            </w:r>
+          </w:p>
+        </w:tc>
+        <w:tc>
+          <w:tcPr>
+            <w:tcW w:type="dxa" w:w="1685"/>
+            <w:tcBorders>
+              <w:top w:val="single" w:color="BFBFBF" w:sz="4"/>
+              <w:left w:val="single" w:color="BFBFBF" w:sz="4"/>
+              <w:bottom w:val="single" w:color="BFBFBF" w:sz="4"/>
+              <w:right w:val="single" w:color="BFBFBF" w:sz="4"/>
+            </w:tcBorders>
+            <w:shd w:fill="FFFFFF" w:color="FFFFFF" w:val="clear"/>
+          </w:tcPr>
+          <w:p>
+            <w:pPr>
+              <w:spacing w:after="40" w:before="40"/>
+            </w:pPr>
+            <w:r>
+              <w:rPr>
+                <w:rFonts w:ascii="Arial" w:cs="Arial" w:eastAsia="Arial" w:hAnsi="Arial"/>
+                <w:sz w:val="18"/>
+                <w:szCs w:val="18"/>
+              </w:rPr>
+              <w:t xml:space="preserve">Yes</w:t>
+            </w:r>
+          </w:p>
+        </w:tc>
+      </w:tr>
+      <w:tr>
+        <w:tc>
+          <w:tcPr>
+            <w:tcW w:type="dxa" w:w="4306"/>
+            <w:tcBorders>
+              <w:top w:val="single" w:color="BFBFBF" w:sz="4"/>
+              <w:left w:val="single" w:color="BFBFBF" w:sz="4"/>
+              <w:bottom w:val="single" w:color="BFBFBF" w:sz="4"/>
+              <w:right w:val="single" w:color="BFBFBF" w:sz="4"/>
+            </w:tcBorders>
+            <w:shd w:fill="F2F2F2" w:color="F2F2F2" w:val="clear"/>
+          </w:tcPr>
+          <w:p>
+            <w:pPr>
+              <w:spacing w:after="40" w:before="40"/>
+            </w:pPr>
+            <w:r>
+              <w:rPr>
+                <w:rFonts w:ascii="Arial" w:cs="Arial" w:eastAsia="Arial" w:hAnsi="Arial"/>
+                <w:sz w:val="18"/>
+                <w:szCs w:val="18"/>
+              </w:rPr>
               <w:t xml:space="preserve">Delete organizations</w:t>
             </w:r>
           </w:p>
@@ -9001,7 +9541,7 @@
               <w:bottom w:val="single" w:color="BFBFBF" w:sz="4"/>
               <w:right w:val="single" w:color="BFBFBF" w:sz="4"/>
             </w:tcBorders>
-            <w:shd w:fill="FFFFFF" w:color="FFFFFF" w:val="clear"/>
+            <w:shd w:fill="F2F2F2" w:color="F2F2F2" w:val="clear"/>
           </w:tcPr>
           <w:p>
             <w:pPr>
@@ -9026,7 +9566,7 @@
               <w:bottom w:val="single" w:color="BFBFBF" w:sz="4"/>
               <w:right w:val="single" w:color="BFBFBF" w:sz="4"/>
             </w:tcBorders>
-            <w:shd w:fill="FFFFFF" w:color="FFFFFF" w:val="clear"/>
+            <w:shd w:fill="F2F2F2" w:color="F2F2F2" w:val="clear"/>
           </w:tcPr>
           <w:p>
             <w:pPr>
@@ -9051,7 +9591,7 @@
               <w:bottom w:val="single" w:color="BFBFBF" w:sz="4"/>
               <w:right w:val="single" w:color="BFBFBF" w:sz="4"/>
             </w:tcBorders>
-            <w:shd w:fill="FFFFFF" w:color="FFFFFF" w:val="clear"/>
+            <w:shd w:fill="F2F2F2" w:color="F2F2F2" w:val="clear"/>
           </w:tcPr>
           <w:p>
             <w:pPr>
@@ -10850,108 +11390,6 @@
           </w:p>
         </w:tc>
       </w:tr>
-      <w:tr>
-        <w:tc>
-          <w:tcPr>
-            <w:tcW w:type="dxa" w:w="4306"/>
-            <w:tcBorders>
-              <w:top w:val="single" w:color="BFBFBF" w:sz="4"/>
-              <w:left w:val="single" w:color="BFBFBF" w:sz="4"/>
-              <w:bottom w:val="single" w:color="BFBFBF" w:sz="4"/>
-              <w:right w:val="single" w:color="BFBFBF" w:sz="4"/>
-            </w:tcBorders>
-            <w:shd w:fill="FFFFFF" w:color="FFFFFF" w:val="clear"/>
-          </w:tcPr>
-          <w:p>
-            <w:pPr>
-              <w:spacing w:after="40" w:before="40"/>
-            </w:pPr>
-            <w:r>
-              <w:rPr>
-                <w:rFonts w:ascii="Arial" w:cs="Arial" w:eastAsia="Arial" w:hAnsi="Arial"/>
-                <w:sz w:val="18"/>
-                <w:szCs w:val="18"/>
-              </w:rPr>
-              <w:t xml:space="preserve">Archive project</w:t>
-            </w:r>
-          </w:p>
-        </w:tc>
-        <w:tc>
-          <w:tcPr>
-            <w:tcW w:type="dxa" w:w="1685"/>
-            <w:tcBorders>
-              <w:top w:val="single" w:color="BFBFBF" w:sz="4"/>
-              <w:left w:val="single" w:color="BFBFBF" w:sz="4"/>
-              <w:bottom w:val="single" w:color="BFBFBF" w:sz="4"/>
-              <w:right w:val="single" w:color="BFBFBF" w:sz="4"/>
-            </w:tcBorders>
-            <w:shd w:fill="FFFFFF" w:color="FFFFFF" w:val="clear"/>
-          </w:tcPr>
-          <w:p>
-            <w:pPr>
-              <w:spacing w:after="40" w:before="40"/>
-            </w:pPr>
-            <w:r>
-              <w:rPr>
-                <w:rFonts w:ascii="Arial" w:cs="Arial" w:eastAsia="Arial" w:hAnsi="Arial"/>
-                <w:sz w:val="18"/>
-                <w:szCs w:val="18"/>
-              </w:rPr>
-              <w:t xml:space="preserve">No</w:t>
-            </w:r>
-          </w:p>
-        </w:tc>
-        <w:tc>
-          <w:tcPr>
-            <w:tcW w:type="dxa" w:w="1685"/>
-            <w:tcBorders>
-              <w:top w:val="single" w:color="BFBFBF" w:sz="4"/>
-              <w:left w:val="single" w:color="BFBFBF" w:sz="4"/>
-              <w:bottom w:val="single" w:color="BFBFBF" w:sz="4"/>
-              <w:right w:val="single" w:color="BFBFBF" w:sz="4"/>
-            </w:tcBorders>
-            <w:shd w:fill="FFFFFF" w:color="FFFFFF" w:val="clear"/>
-          </w:tcPr>
-          <w:p>
-            <w:pPr>
-              <w:spacing w:after="40" w:before="40"/>
-            </w:pPr>
-            <w:r>
-              <w:rPr>
-                <w:rFonts w:ascii="Arial" w:cs="Arial" w:eastAsia="Arial" w:hAnsi="Arial"/>
-                <w:sz w:val="18"/>
-                <w:szCs w:val="18"/>
-              </w:rPr>
-              <w:t xml:space="preserve">No</w:t>
-            </w:r>
-          </w:p>
-        </w:tc>
-        <w:tc>
-          <w:tcPr>
-            <w:tcW w:type="dxa" w:w="1685"/>
-            <w:tcBorders>
-              <w:top w:val="single" w:color="BFBFBF" w:sz="4"/>
-              <w:left w:val="single" w:color="BFBFBF" w:sz="4"/>
-              <w:bottom w:val="single" w:color="BFBFBF" w:sz="4"/>
-              <w:right w:val="single" w:color="BFBFBF" w:sz="4"/>
-            </w:tcBorders>
-            <w:shd w:fill="FFFFFF" w:color="FFFFFF" w:val="clear"/>
-          </w:tcPr>
-          <w:p>
-            <w:pPr>
-              <w:spacing w:after="40" w:before="40"/>
-            </w:pPr>
-            <w:r>
-              <w:rPr>
-                <w:rFonts w:ascii="Arial" w:cs="Arial" w:eastAsia="Arial" w:hAnsi="Arial"/>
-                <w:sz w:val="18"/>
-                <w:szCs w:val="18"/>
-              </w:rPr>
-              <w:t xml:space="preserve">Yes</w:t>
-            </w:r>
-          </w:p>
-        </w:tc>
-      </w:tr>
     </w:tbl>
     <w:p>
       <w:pPr>
@@ -12425,25 +12863,6 @@
           <w:sz w:val="20"/>
           <w:szCs w:val="20"/>
         </w:rPr>
-        <w:t xml:space="preserve">Custom workflow system — wire Board/Column models to the Kanban renderer; Admin-managed statuses</w:t>
-      </w:r>
-    </w:p>
-    <w:p>
-      <w:pPr>
-        <w:pStyle w:val="ListParagraph"/>
-        <w:numPr>
-          <w:ilvl w:val="0"/>
-          <w:numId w:val="2"/>
-        </w:numPr>
-        <w:spacing w:after="20" w:before="20"/>
-        <w:ind w:left="360" w:hanging="360"/>
-      </w:pPr>
-      <w:r>
-        <w:rPr>
-          <w:rFonts w:ascii="Arial" w:cs="Arial" w:eastAsia="Arial" w:hAnsi="Arial"/>
-          <w:sz w:val="20"/>
-          <w:szCs w:val="20"/>
-        </w:rPr>
         <w:t xml:space="preserve">Sprints &amp; Iterations</w:t>
       </w:r>
     </w:p>
@@ -12672,25 +13091,6 @@
           <w:szCs w:val="20"/>
         </w:rPr>
         <w:t xml:space="preserve">AutoRefresh interval: currently 3 minutes. Will be replaced entirely by SSE — no interim change planned.</w:t>
-      </w:r>
-    </w:p>
-    <w:p>
-      <w:pPr>
-        <w:pStyle w:val="ListParagraph"/>
-        <w:numPr>
-          <w:ilvl w:val="0"/>
-          <w:numId w:val="2"/>
-        </w:numPr>
-        <w:spacing w:after="20" w:before="20"/>
-        <w:ind w:left="360" w:hanging="360"/>
-      </w:pPr>
-      <w:r>
-        <w:rPr>
-          <w:rFonts w:ascii="Arial" w:cs="Arial" w:eastAsia="Arial" w:hAnsi="Arial"/>
-          <w:sz w:val="20"/>
-          <w:szCs w:val="20"/>
-        </w:rPr>
-        <w:t xml:space="preserve">Custom workflow architecture: Board/Column models are in the schema but the UI and API integration are not yet designed.</w:t>
       </w:r>
     </w:p>
     <w:p>
@@ -13436,7 +13836,7 @@
           <w:sz w:val="20"/>
           <w:szCs w:val="20"/>
         </w:rPr>
-        <w:t xml:space="preserve">IssueStatus and IssuePriority are enums synthesised in API responses (not DB tables).</w:t>
+        <w:t xml:space="preserve">IssueStatus is not an enum — statusId accepts a ProjectStatus cuid, a human name ("Done"), or a category key ("DONE"). IssuePriority is a true enum synthesised in API responses (not a DB table).</w:t>
       </w:r>
     </w:p>
     <w:p>

</xml_diff>